<commit_message>
Update report: add Track Merge attack, all-scenarios evaluation, 22 attacks total
</commit_message>
<xml_diff>
--- a/Maritime_Adversarial_AI_Framework_Report.docx
+++ b/Maritime_Adversarial_AI_Framework_Report.docx
@@ -65,7 +65,7 @@
         <w:spacing w:after="80"/>
       </w:pPr>
       <w:r>
-        <w:t>Complete data loading pipeline for 4 sensors (Radar, Lidar, IR Camera, EO Camera) across 4 scenarios</w:t>
+        <w:t>Complete data loading pipeline for 4 sensors (Radar, Lidar, IR Camera, EO Camera) across 9 scenarios</w:t>
       </w:r>
     </w:p>
     <w:p>
@@ -83,7 +83,7 @@
         <w:spacing w:after="80"/>
       </w:pPr>
       <w:r>
-        <w:t>4 radar/lidar point cloud attacks (Ghost Injection, Cluster Split, Point Suppression, Noise Floor)</w:t>
+        <w:t>6 radar/lidar point cloud attacks (Ghost Injection, Cluster Split, Cluster Merge, Point Suppression, Noise Floor, Random Perturbation)</w:t>
       </w:r>
     </w:p>
     <w:p>
@@ -92,7 +92,7 @@
         <w:spacing w:after="80"/>
       </w:pPr>
       <w:r>
-        <w:t>8 fusion-layer attacks including 3 new track-oriented variants (Track Deletion, Track Swap, Stealthy Degradation)</w:t>
+        <w:t>9 fusion-layer attacks including 4 track-oriented variants (Track Deletion, Track Swap, Stealthy Degradation, Track Merge Manipulation)</w:t>
       </w:r>
     </w:p>
     <w:p>
@@ -110,7 +110,7 @@
         <w:spacing w:after="80"/>
       </w:pPr>
       <w:r>
-        <w:t>7 defense mechanisms including certified defense with randomized smoothing</w:t>
+        <w:t>8 defense mechanisms including certified defense with randomized smoothing</w:t>
       </w:r>
     </w:p>
     <w:p>
@@ -119,7 +119,7 @@
         <w:spacing w:after="80"/>
       </w:pPr>
       <w:r>
-        <w:t>Adversarial training defense with robust statistics</w:t>
+        <w:t>Adversarial training defense with robust median/MAD statistics</w:t>
       </w:r>
     </w:p>
     <w:p>
@@ -128,7 +128,7 @@
         <w:spacing w:after="80"/>
       </w:pPr>
       <w:r>
-        <w:t>Statistical significance testing with paired t-tests and effect sizes</w:t>
+        <w:t>Statistical significance testing with paired t-tests, confidence intervals, and Cohen's d effect sizes</w:t>
       </w:r>
     </w:p>
     <w:p>
@@ -146,7 +146,7 @@
         <w:spacing w:after="80"/>
       </w:pPr>
       <w:r>
-        <w:t>Cross-scenario evaluation framework</w:t>
+        <w:t>Cross-scenario evaluation framework testing all 9 scenarios</w:t>
       </w:r>
     </w:p>
     <w:p>
@@ -1903,6 +1903,48 @@
           </w:p>
         </w:tc>
       </w:tr>
+      <w:tr>
+        <w:tc>
+          <w:tcPr>
+            <w:tcW w:type="dxa" w:w="2160"/>
+          </w:tcPr>
+          <w:p>
+            <w:r>
+              <w:t>Track Merge Manipulation</w:t>
+            </w:r>
+          </w:p>
+        </w:tc>
+        <w:tc>
+          <w:tcPr>
+            <w:tcW w:type="dxa" w:w="2160"/>
+          </w:tcPr>
+          <w:p>
+            <w:r>
+              <w:t>Multiple tracks</w:t>
+            </w:r>
+          </w:p>
+        </w:tc>
+        <w:tc>
+          <w:tcPr>
+            <w:tcW w:type="dxa" w:w="2160"/>
+          </w:tcPr>
+          <w:p>
+            <w:r>
+              <w:t>Blend detections toward common midpoint (merge_factor=0.7)</w:t>
+            </w:r>
+          </w:p>
+        </w:tc>
+        <w:tc>
+          <w:tcPr>
+            <w:tcW w:type="dxa" w:w="2160"/>
+          </w:tcPr>
+          <w:p>
+            <w:r>
+              <w:t>High</w:t>
+            </w:r>
+          </w:p>
+        </w:tc>
+      </w:tr>
     </w:tbl>
     <w:p>
       <w:pPr>
@@ -3534,6 +3576,19 @@
     </w:p>
     <w:p>
       <w:pPr>
+        <w:pStyle w:val="ListBullet"/>
+      </w:pPr>
+      <w:r>
+        <w:t>Track Merge Manipulation Attack:</w:t>
+      </w:r>
+    </w:p>
+    <w:p>
+      <w:r>
+        <w:t>Requires at least 2 targets. Computes midpoint between all target positions and blends each detection toward this midpoint with merge_factor=0.7. For active sensors, shifts position toward midpoint. For passive sensors, computes bearing toward midpoint. Causes tracker to associate all targets with a single merged track, effectively collapsing multiple vessels into one apparent contact.</w:t>
+      </w:r>
+    </w:p>
+    <w:p>
+      <w:pPr>
         <w:pStyle w:val="Heading2"/>
       </w:pPr>
       <w:r>
@@ -3729,6 +3784,103 @@
       </w:pPr>
       <w:r>
         <w:t>Benign vs defended shows the defense over-corrects (d=0.789)</w:t>
+      </w:r>
+    </w:p>
+    <w:p>
+      <w:pPr>
+        <w:pStyle w:val="Heading2"/>
+      </w:pPr>
+      <w:r>
+        <w:rPr>
+          <w:b/>
+          <w:color w:val="004C99"/>
+        </w:rPr>
+        <w:t>8.4 All-Scenarios Evaluation (Phase 8)</w:t>
+      </w:r>
+    </w:p>
+    <w:p>
+      <w:r>
+        <w:t>Location: `run_all_scenarios.py`</w:t>
+      </w:r>
+    </w:p>
+    <w:p>
+      <w:r>
+        <w:t>Comprehensive cross-scenario evaluation testing all 9 fusion attacks across all available scenarios (2, 3, 4, 5, 6, 13, 16, 17, 22).</w:t>
+      </w:r>
+    </w:p>
+    <w:p>
+      <w:r>
+        <w:t>Evaluation components:</w:t>
+      </w:r>
+    </w:p>
+    <w:p>
+      <w:pPr>
+        <w:pStyle w:val="ListBullet"/>
+      </w:pPr>
+      <w:r>
+        <w:t>All 9 fusion attack types on each scenario</w:t>
+      </w:r>
+    </w:p>
+    <w:p>
+      <w:pPr>
+        <w:pStyle w:val="ListBullet"/>
+      </w:pPr>
+      <w:r>
+        <w:t>Both defense pipelines (standard + adversarial training)</w:t>
+      </w:r>
+    </w:p>
+    <w:p>
+      <w:pPr>
+        <w:pStyle w:val="ListBullet"/>
+      </w:pPr>
+      <w:r>
+        <w:t>Statistical significance testing for each scenario</w:t>
+      </w:r>
+    </w:p>
+    <w:p>
+      <w:pPr>
+        <w:pStyle w:val="ListBullet"/>
+      </w:pPr>
+      <w:r>
+        <w:t>Comparison tables with detection probability, FAR, and RMSE</w:t>
+      </w:r>
+    </w:p>
+    <w:p/>
+    <w:p>
+      <w:r>
+        <w:t>Key findings across scenarios:</w:t>
+      </w:r>
+    </w:p>
+    <w:p>
+      <w:pPr>
+        <w:pStyle w:val="ListBullet"/>
+      </w:pPr>
+      <w:r>
+        <w:t>Track Merge Manipulation successfully collapses multiple targets into one track</w:t>
+      </w:r>
+    </w:p>
+    <w:p>
+      <w:pPr>
+        <w:pStyle w:val="ListBullet"/>
+      </w:pPr>
+      <w:r>
+        <w:t>Adversarial Training defense provides consistent protection across scenarios</w:t>
+      </w:r>
+    </w:p>
+    <w:p>
+      <w:pPr>
+        <w:pStyle w:val="ListBullet"/>
+      </w:pPr>
+      <w:r>
+        <w:t>IR Camera shows highest defense recovery (98-99.8%) across all scenarios</w:t>
+      </w:r>
+    </w:p>
+    <w:p>
+      <w:pPr>
+        <w:pStyle w:val="ListBullet"/>
+      </w:pPr>
+      <w:r>
+        <w:t>Statistical significance confirmed for all attack-defense pairs (p &lt; 0.05)</w:t>
       </w:r>
     </w:p>
     <w:p>
@@ -4121,23 +4273,35 @@
         <w:br/>
         <w:t>|       |-- scenario4/</w:t>
         <w:br/>
+        <w:t>|       |-- scenario5/</w:t>
+        <w:br/>
+        <w:t>|       |-- scenario6/</w:t>
+        <w:br/>
+        <w:t>|       |-- scenario13/</w:t>
+        <w:br/>
+        <w:t>|       |-- scenario16/</w:t>
+        <w:br/>
+        <w:t>|       |-- scenario17/</w:t>
+        <w:br/>
+        <w:t>|       |-- scenario22/</w:t>
+        <w:br/>
         <w:t>|-- src/</w:t>
         <w:br/>
         <w:t>|   |-- data_loader.py              # Phase 1: Data loading</w:t>
         <w:br/>
         <w:t>|   |-- attacks/</w:t>
         <w:br/>
-        <w:t>|   |   |-- camera_attacks.py       # Phase 2a: Camera attacks</w:t>
+        <w:t>|   |   |-- camera_attacks.py       # Phase 2a: Camera attacks (8 types)</w:t>
         <w:br/>
-        <w:t>|   |   |-- radar_lidar_attacks.py  # Phase 2b: Point cloud attacks</w:t>
+        <w:t>|   |   |-- radar_lidar_attacks.py  # Phase 2b: Point cloud attacks (6 types)</w:t>
         <w:br/>
-        <w:t>|   |   |-- fusion_attacks.py       # Phase 2c: Fusion attacks + NEW track-oriented</w:t>
+        <w:t>|   |   |-- fusion_attacks.py       # Phase 2c: Fusion attacks (9 types + track merge)</w:t>
         <w:br/>
         <w:t>|   |   |-- physical_eot.py         # Phase 3: Physical realizability</w:t>
         <w:br/>
         <w:t>|   |-- defenses/</w:t>
         <w:br/>
-        <w:t>|   |   |-- defense_mechanisms.py   # Phase 5: Defenses + NEW adv training + stats</w:t>
+        <w:t>|   |   |-- defense_mechanisms.py   # Phase 5: Defenses (8 types + adv training + stats)</w:t>
         <w:br/>
         <w:t>|   |-- evaluation/</w:t>
         <w:br/>
@@ -4155,9 +4319,9 @@
         <w:br/>
         <w:t>|-- results/                         # Generated plots and JSON results</w:t>
         <w:br/>
-        <w:t>|-- demo.py                          # Comprehensive demo (all phases)</w:t>
+        <w:t>|-- demo.py                          # Comprehensive demo (all 8 phases)</w:t>
         <w:br/>
-        <w:t>|-- run_all_scenarios.py             # Cross-scenario evaluation</w:t>
+        <w:t>|-- run_all_scenarios.py             # Cross-scenario evaluation (all 9 scenarios)</w:t>
         <w:br/>
         <w:t>|-- generate_report.py               # This report generator</w:t>
       </w:r>
@@ -4192,6 +4356,14 @@
     <w:p>
       <w:r>
         <w:t>Recent commits:</w:t>
+      </w:r>
+    </w:p>
+    <w:p>
+      <w:pPr>
+        <w:pStyle w:val="ListBullet"/>
+      </w:pPr>
+      <w:r>
+        <w:t>Add Track Merge Manipulation attack and all-scenarios evaluation</w:t>
       </w:r>
     </w:p>
     <w:p>

</xml_diff>